<commit_message>
Italicize configurational cis/trans throughout (Reviewer 2)
add_body and figure captions now split text into runs and italicize whole-word
cis / trans (and Cis / Trans), the standard typographic convention for
configurational descriptors. The reference-list "ACM Trans." (Transactions)
correctly stays roman as it is rendered by a separate loop.

Co-Authored-By: Claude Opus 4.8 <noreply@anthropic.com>
</commit_message>
<xml_diff>
--- a/GFP_JCIM_Manuscript.docx
+++ b/GFP_JCIM_Manuscript.docx
@@ -338,7 +338,67 @@
           <w:rFonts w:ascii="Times New Roman" w:hAnsi="Times New Roman"/>
           <w:sz w:val="24"/>
         </w:rPr>
-        <w:t>Chromophore dihedral angles were defined following Megley et al.:²⁷ τ = N₁–C₁–C₂–C₃ (PDB atoms N2–CA2–CB2–CG2), describing rotation about the imidazolinone–bridge bond, and φ = C₁–C₂–C₃–C₄ (atoms CA2–CB2–CG2–CD1), describing rotation about the bridge–phenol bond. Structures with |τ| &lt; 30° were classified as cis, |τ| &gt; 150° as trans, and the remainder as twisted. Absolute magnitudes |τ| and |φ| are used in correlation analyses as descriptive measures of out-of-plane chromophore distortion, irrespective of cis/trans configuration; the algebraic sum τ + φ is likewise treated as a descriptive composite of the two rotations and is not interpreted in the mechanistic sense of the hula-twist photoisomerization pathway. Valid angles were obtained for 690 structures (Table S1).</w:t>
+        <w:t xml:space="preserve">Chromophore dihedral angles were defined following Megley et al.:²⁷ τ = N₁–C₁–C₂–C₃ (PDB atoms N2–CA2–CB2–CG2), describing rotation about the imidazolinone–bridge bond, and φ = C₁–C₂–C₃–C₄ (atoms CA2–CB2–CG2–CD1), describing rotation about the bridge–phenol bond. Structures with |τ| &lt; 30° were classified as </w:t>
+      </w:r>
+      <w:r>
+        <w:rPr>
+          <w:rFonts w:ascii="Times New Roman" w:hAnsi="Times New Roman"/>
+          <w:i/>
+          <w:sz w:val="24"/>
+        </w:rPr>
+        <w:t>cis</w:t>
+      </w:r>
+      <w:r>
+        <w:rPr>
+          <w:rFonts w:ascii="Times New Roman" w:hAnsi="Times New Roman"/>
+          <w:sz w:val="24"/>
+        </w:rPr>
+        <w:t xml:space="preserve">, |τ| &gt; 150° as </w:t>
+      </w:r>
+      <w:r>
+        <w:rPr>
+          <w:rFonts w:ascii="Times New Roman" w:hAnsi="Times New Roman"/>
+          <w:i/>
+          <w:sz w:val="24"/>
+        </w:rPr>
+        <w:t>trans</w:t>
+      </w:r>
+      <w:r>
+        <w:rPr>
+          <w:rFonts w:ascii="Times New Roman" w:hAnsi="Times New Roman"/>
+          <w:sz w:val="24"/>
+        </w:rPr>
+        <w:t xml:space="preserve">, and the remainder as twisted. Absolute magnitudes |τ| and |φ| are used in correlation analyses as descriptive measures of out-of-plane chromophore distortion, irrespective of </w:t>
+      </w:r>
+      <w:r>
+        <w:rPr>
+          <w:rFonts w:ascii="Times New Roman" w:hAnsi="Times New Roman"/>
+          <w:i/>
+          <w:sz w:val="24"/>
+        </w:rPr>
+        <w:t>cis</w:t>
+      </w:r>
+      <w:r>
+        <w:rPr>
+          <w:rFonts w:ascii="Times New Roman" w:hAnsi="Times New Roman"/>
+          <w:sz w:val="24"/>
+        </w:rPr>
+        <w:t>/</w:t>
+      </w:r>
+      <w:r>
+        <w:rPr>
+          <w:rFonts w:ascii="Times New Roman" w:hAnsi="Times New Roman"/>
+          <w:i/>
+          <w:sz w:val="24"/>
+        </w:rPr>
+        <w:t>trans</w:t>
+      </w:r>
+      <w:r>
+        <w:rPr>
+          <w:rFonts w:ascii="Times New Roman" w:hAnsi="Times New Roman"/>
+          <w:sz w:val="24"/>
+        </w:rPr>
+        <w:t xml:space="preserve"> configuration; the algebraic sum τ + φ is likewise treated as a descriptive composite of the two rotations and is not interpreted in the mechanistic sense of the hula-twist photoisomerization pathway. Valid angles were obtained for 690 structures (Table S1).</w:t>
       </w:r>
     </w:p>
     <w:p>
@@ -482,7 +542,37 @@
           <w:rFonts w:ascii="Times New Roman" w:hAnsi="Times New Roman"/>
           <w:sz w:val="24"/>
         </w:rPr>
-        <w:t>Analyses were performed in Python 3.14 using SciPy³⁹ and scikit-learn.⁴⁰ Spearman rank correlations assessed monotonic relationships between continuous variables. Mann–Whitney U tests compared two groups; Kruskal–Wallis H tests compared multiple groups. All reported p-values were corrected for multiple testing using the Benjamini–Hochberg false discovery rate (FDR) procedure; the family comprised 63 pre-specified hypothesis tests covering all meaningful pairwise Spearman correlations among the six geometry metrics, four photophysical variables (em_max, lit_qy, stokes_shift, b_factor_ratio), and crystallographic resolution; eleven dihedral correlations involving τ, φ, |τ|, |φ|, the signed sum τ + φ, and ground-state planarity; plus the five Mann–Whitney chromophore-present vs absent tests, the three cis-vs-trans tests, and the three Kruskal–Wallis by color class tests. The complete list with raw and BH-corrected p-values is provided in Table S4; 45 of 63 tests survive the FDR threshold at q &lt; 0.05. Partial Spearman correlations controlling for crystallographic resolution were computed by the rank-residual method: all three variables were rank-transformed, the rank-transformed dependent and independent variables were each regressed on rank-transformed resolution by ordinary least squares, and the Pearson correlation of the residuals was reported (equivalent to the partial Spearman correlation).</w:t>
+        <w:t xml:space="preserve">Analyses were performed in Python 3.14 using SciPy³⁹ and scikit-learn.⁴⁰ Spearman rank correlations assessed monotonic relationships between continuous variables. Mann–Whitney U tests compared two groups; Kruskal–Wallis H tests compared multiple groups. All reported p-values were corrected for multiple testing using the Benjamini–Hochberg false discovery rate (FDR) procedure; the family comprised 63 pre-specified hypothesis tests covering all meaningful pairwise Spearman correlations among the six geometry metrics, four photophysical variables (em_max, lit_qy, stokes_shift, b_factor_ratio), and crystallographic resolution; eleven dihedral correlations involving τ, φ, |τ|, |φ|, the signed sum τ + φ, and ground-state planarity; plus the five Mann–Whitney chromophore-present vs absent tests, the three </w:t>
+      </w:r>
+      <w:r>
+        <w:rPr>
+          <w:rFonts w:ascii="Times New Roman" w:hAnsi="Times New Roman"/>
+          <w:i/>
+          <w:sz w:val="24"/>
+        </w:rPr>
+        <w:t>cis</w:t>
+      </w:r>
+      <w:r>
+        <w:rPr>
+          <w:rFonts w:ascii="Times New Roman" w:hAnsi="Times New Roman"/>
+          <w:sz w:val="24"/>
+        </w:rPr>
+        <w:t>-vs-</w:t>
+      </w:r>
+      <w:r>
+        <w:rPr>
+          <w:rFonts w:ascii="Times New Roman" w:hAnsi="Times New Roman"/>
+          <w:i/>
+          <w:sz w:val="24"/>
+        </w:rPr>
+        <w:t>trans</w:t>
+      </w:r>
+      <w:r>
+        <w:rPr>
+          <w:rFonts w:ascii="Times New Roman" w:hAnsi="Times New Roman"/>
+          <w:sz w:val="24"/>
+        </w:rPr>
+        <w:t xml:space="preserve"> tests, and the three Kruskal–Wallis by color class tests. The complete list with raw and BH-corrected p-values is provided in Table S4; 45 of 63 tests survive the FDR threshold at q &lt; 0.05. Partial Spearman correlations controlling for crystallographic resolution were computed by the rank-residual method: all three variables were rank-transformed, the rank-transformed dependent and independent variables were each regressed on rank-transformed resolution by ordinary least squares, and the Pearson correlation of the residuals was reported (equivalent to the partial Spearman correlation).</w:t>
       </w:r>
     </w:p>
     <w:p>
@@ -855,7 +945,202 @@
           <w:rFonts w:ascii="Times New Roman" w:hAnsi="Times New Roman"/>
           <w:sz w:val="24"/>
         </w:rPr>
-        <w:t>τ and φ dihedral angles were computed for 603 canonical-cohort structures (590 of which were classifiable as cis, trans, or twisted). Cis configurations predominated (441, 74.7%), with 111 trans (18.8%) and 38 twisted (6.4%). The τ angle correlated with eccentricity (ρ = –0.197, p = 1.1 × 10⁻⁶). Absolute twist magnitudes correlated with eccentricity (|τ|: ρ = +0.167; |φ|: ρ = +0.197) and B-factor ratio (|τ|: ρ = +0.158; |φ|: ρ = +0.155). The signed sum τ + φ was the strongest dihedral predictor of emission (ρ = –0.311, p = 1.0 × 10⁻¹²; Figure S7C). We note that τ + φ is used here as a descriptive algebraic sum of two static crystallographic dihedral angles, not in the mechanistic sense of the hula-twist photoisomerization pathway. To relate chromophore geometry to quantum yield we use the angular distance from the deposited (τ, φ) to the nearest planar reference, taking the minimum over the four planar settings (0°, 0°), (0°, 180°), (180°, 0°), and (180°, 180°). This folds the 180° phenol symmetry and the cis/trans degeneracy, so that a near-planar trans or ring-flipped chromophore is correctly scored as planar; an unfolded |τ| + |φ| sum instead misregisters such structures as maximally twisted (for example, near-planar mScarlet, φ ≈ 179°, which scores 180° rather than 2° from planar). Barrel cross-sectional metrics — area, minor axis, and eccentricity — are at best weak correlates of quantum yield (all |ρ| &lt; 0.16), confirming that within-class brightness is not set by barrel size; the quantum-yield-relevant structural signals lie instead in how the barrel restrains the chromophore. Collapsing replicate crystals to one entry per protein (n = 123 unique FPs with both metrics; Table S6), two such features carry independent signals: the chromophore-to-barrel B-factor ratio (ρ = –0.49, p &lt; 10⁻⁴) and the chromophore’s ground-state planarity (distance-from-planar vs QY, ρ = –0.42, p = 1 × 10⁻⁴); each survives adjustment for the other (partial ρ = –0.43 and –0.35). Neither is dominant, and both are modest, consistent with quantum yield being shaped by several structural routes — ground-state geometry, thermal damping, and local electrostatics — rather than a single geometric lever. The pooled, per-crystal correlation using the unfolded twist sum (ρ = –0.37) overstates this relationship: it is inflated by replicate crystals and by between-class structure and conflates the phenol-flip coordinate with genuine non-planarity. The within-class structure of the planarity–brightness association — its concentration in red FPs, which span a wide range of ground-state twist, versus green FPs, which cluster near planar with little spread — is characterized in detail in a companion analysis of chromophore torsional space.⁴² These two structural routes are consistent with recent excited-state studies: in red FPs a pre-twisted ground-state chromophore brings the S₁/S₀ conical intersection to or below the Franck–Condon energy, making non-radiative decay nearly barrierless,⁴³ while chromophore rigidity — not planarity alone — can be the decisive factor in engineered variants,⁴⁴ paralleling the independent B-factor-ratio signal reported here. This extends the findings of Megley et al.²⁷ from a small set of structures to 603. Within this dataset, τ and φ are negatively correlated across all structures (ρ = –0.357, p &lt; 0.001; Figure S7A), forming two parallel bands in the τ–φ plane corresponding to cis and trans configurations. This anticorrelation primarily reflects the bimodal distribution of configurational states: cis structures (τ ≈ 0°) and trans structures (τ ≈ ±180°) each occupy distinct, non-overlapping regions of the τ–φ plane, such that the negative population-level correlation is a geometric consequence of the discrete classification rather than evidence for dynamic coupling between the two bonds in individual structures. Nevertheless, the relative positioning of τ and φ within each class may influence effective conjugation length. Twisted chromophores reside in more eccentric barrels with narrower minor axes. These observations are consistent with a model in which extended conjugation is associated with an asymmetric barrel that provides less symmetric constraint on torsional freedom, potentially allowing greater non-planar distortion and increased non-radiative decay. Trans-configured chromophores had higher eccentricity than cis (0.44 vs 0.40, p &lt; 0.001), lower circularity (0.918 vs 0.923, p = 0.019), and narrower minor axes (29.2 vs 29.6 Å, p = 0.003; Figure S2). The full dihedral analysis is shown in Figure S7.</w:t>
+        <w:t xml:space="preserve">τ and φ dihedral angles were computed for 603 canonical-cohort structures (590 of which were classifiable as </w:t>
+      </w:r>
+      <w:r>
+        <w:rPr>
+          <w:rFonts w:ascii="Times New Roman" w:hAnsi="Times New Roman"/>
+          <w:i/>
+          <w:sz w:val="24"/>
+        </w:rPr>
+        <w:t>cis</w:t>
+      </w:r>
+      <w:r>
+        <w:rPr>
+          <w:rFonts w:ascii="Times New Roman" w:hAnsi="Times New Roman"/>
+          <w:sz w:val="24"/>
+        </w:rPr>
+        <w:t xml:space="preserve">, </w:t>
+      </w:r>
+      <w:r>
+        <w:rPr>
+          <w:rFonts w:ascii="Times New Roman" w:hAnsi="Times New Roman"/>
+          <w:i/>
+          <w:sz w:val="24"/>
+        </w:rPr>
+        <w:t>trans</w:t>
+      </w:r>
+      <w:r>
+        <w:rPr>
+          <w:rFonts w:ascii="Times New Roman" w:hAnsi="Times New Roman"/>
+          <w:sz w:val="24"/>
+        </w:rPr>
+        <w:t xml:space="preserve">, or twisted). </w:t>
+      </w:r>
+      <w:r>
+        <w:rPr>
+          <w:rFonts w:ascii="Times New Roman" w:hAnsi="Times New Roman"/>
+          <w:i/>
+          <w:sz w:val="24"/>
+        </w:rPr>
+        <w:t>Cis</w:t>
+      </w:r>
+      <w:r>
+        <w:rPr>
+          <w:rFonts w:ascii="Times New Roman" w:hAnsi="Times New Roman"/>
+          <w:sz w:val="24"/>
+        </w:rPr>
+        <w:t xml:space="preserve"> configurations predominated (441, 74.7%), with 111 </w:t>
+      </w:r>
+      <w:r>
+        <w:rPr>
+          <w:rFonts w:ascii="Times New Roman" w:hAnsi="Times New Roman"/>
+          <w:i/>
+          <w:sz w:val="24"/>
+        </w:rPr>
+        <w:t>trans</w:t>
+      </w:r>
+      <w:r>
+        <w:rPr>
+          <w:rFonts w:ascii="Times New Roman" w:hAnsi="Times New Roman"/>
+          <w:sz w:val="24"/>
+        </w:rPr>
+        <w:t xml:space="preserve"> (18.8%) and 38 twisted (6.4%). The τ angle correlated with eccentricity (ρ = –0.197, p = 1.1 × 10⁻⁶). Absolute twist magnitudes correlated with eccentricity (|τ|: ρ = +0.167; |φ|: ρ = +0.197) and B-factor ratio (|τ|: ρ = +0.158; |φ|: ρ = +0.155). The signed sum τ + φ was the strongest dihedral predictor of emission (ρ = –0.311, p = 1.0 × 10⁻¹²; Figure S7C). We note that τ + φ is used here as a descriptive algebraic sum of two static crystallographic dihedral angles, not in the mechanistic sense of the hula-twist photoisomerization pathway. To relate chromophore geometry to quantum yield we use the angular distance from the deposited (τ, φ) to the nearest planar reference, taking the minimum over the four planar settings (0°, 0°), (0°, 180°), (180°, 0°), and (180°, 180°). This folds the 180° phenol symmetry and the </w:t>
+      </w:r>
+      <w:r>
+        <w:rPr>
+          <w:rFonts w:ascii="Times New Roman" w:hAnsi="Times New Roman"/>
+          <w:i/>
+          <w:sz w:val="24"/>
+        </w:rPr>
+        <w:t>cis</w:t>
+      </w:r>
+      <w:r>
+        <w:rPr>
+          <w:rFonts w:ascii="Times New Roman" w:hAnsi="Times New Roman"/>
+          <w:sz w:val="24"/>
+        </w:rPr>
+        <w:t>/</w:t>
+      </w:r>
+      <w:r>
+        <w:rPr>
+          <w:rFonts w:ascii="Times New Roman" w:hAnsi="Times New Roman"/>
+          <w:i/>
+          <w:sz w:val="24"/>
+        </w:rPr>
+        <w:t>trans</w:t>
+      </w:r>
+      <w:r>
+        <w:rPr>
+          <w:rFonts w:ascii="Times New Roman" w:hAnsi="Times New Roman"/>
+          <w:sz w:val="24"/>
+        </w:rPr>
+        <w:t xml:space="preserve"> degeneracy, so that a near-planar </w:t>
+      </w:r>
+      <w:r>
+        <w:rPr>
+          <w:rFonts w:ascii="Times New Roman" w:hAnsi="Times New Roman"/>
+          <w:i/>
+          <w:sz w:val="24"/>
+        </w:rPr>
+        <w:t>trans</w:t>
+      </w:r>
+      <w:r>
+        <w:rPr>
+          <w:rFonts w:ascii="Times New Roman" w:hAnsi="Times New Roman"/>
+          <w:sz w:val="24"/>
+        </w:rPr>
+        <w:t xml:space="preserve"> or ring-flipped chromophore is correctly scored as planar; an unfolded |τ| + |φ| sum instead misregisters such structures as maximally twisted (for example, near-planar mScarlet, φ ≈ 179°, which scores 180° rather than 2° from planar). Barrel cross-sectional metrics — area, minor axis, and eccentricity — are at best weak correlates of quantum yield (all |ρ| &lt; 0.16), confirming that within-class brightness is not set by barrel size; the quantum-yield-relevant structural signals lie instead in how the barrel restrains the chromophore. Collapsing replicate crystals to one entry per protein (n = 123 unique FPs with both metrics; Table S6), two such features carry independent signals: the chromophore-to-barrel B-factor ratio (ρ = –0.49, p &lt; 10⁻⁴) and the chromophore’s ground-state planarity (distance-from-planar vs QY, ρ = –0.42, p = 1 × 10⁻⁴); each survives adjustment for the other (partial ρ = –0.43 and –0.35). Neither is dominant, and both are modest, consistent with quantum yield being shaped by several structural routes — ground-state geometry, thermal damping, and local electrostatics — rather than a single geometric lever. The pooled, per-crystal correlation using the unfolded twist sum (ρ = –0.37) overstates this relationship: it is inflated by replicate crystals and by between-class structure and conflates the phenol-flip coordinate with genuine non-planarity. The within-class structure of the planarity–brightness association — its concentration in red FPs, which span a wide range of ground-state twist, versus green FPs, which cluster near planar with little spread — is characterized in detail in a companion analysis of chromophore torsional space.⁴² These two structural routes are consistent with recent excited-state studies: in red FPs a pre-twisted ground-state chromophore brings the S₁/S₀ conical intersection to or below the Franck–Condon energy, making non-radiative decay nearly barrierless,⁴³ while chromophore rigidity — not planarity alone — can be the decisive factor in engineered variants,⁴⁴ paralleling the independent B-factor-ratio signal reported here. This extends the findings of Megley et al.²⁷ from a small set of structures to 603. Within this dataset, τ and φ are negatively correlated across all structures (ρ = –0.357, p &lt; 0.001; Figure S7A), forming two parallel bands in the τ–φ plane corresponding to </w:t>
+      </w:r>
+      <w:r>
+        <w:rPr>
+          <w:rFonts w:ascii="Times New Roman" w:hAnsi="Times New Roman"/>
+          <w:i/>
+          <w:sz w:val="24"/>
+        </w:rPr>
+        <w:t>cis</w:t>
+      </w:r>
+      <w:r>
+        <w:rPr>
+          <w:rFonts w:ascii="Times New Roman" w:hAnsi="Times New Roman"/>
+          <w:sz w:val="24"/>
+        </w:rPr>
+        <w:t xml:space="preserve"> and </w:t>
+      </w:r>
+      <w:r>
+        <w:rPr>
+          <w:rFonts w:ascii="Times New Roman" w:hAnsi="Times New Roman"/>
+          <w:i/>
+          <w:sz w:val="24"/>
+        </w:rPr>
+        <w:t>trans</w:t>
+      </w:r>
+      <w:r>
+        <w:rPr>
+          <w:rFonts w:ascii="Times New Roman" w:hAnsi="Times New Roman"/>
+          <w:sz w:val="24"/>
+        </w:rPr>
+        <w:t xml:space="preserve"> configurations. This anticorrelation primarily reflects the bimodal distribution of configurational states: </w:t>
+      </w:r>
+      <w:r>
+        <w:rPr>
+          <w:rFonts w:ascii="Times New Roman" w:hAnsi="Times New Roman"/>
+          <w:i/>
+          <w:sz w:val="24"/>
+        </w:rPr>
+        <w:t>cis</w:t>
+      </w:r>
+      <w:r>
+        <w:rPr>
+          <w:rFonts w:ascii="Times New Roman" w:hAnsi="Times New Roman"/>
+          <w:sz w:val="24"/>
+        </w:rPr>
+        <w:t xml:space="preserve"> structures (τ ≈ 0°) and </w:t>
+      </w:r>
+      <w:r>
+        <w:rPr>
+          <w:rFonts w:ascii="Times New Roman" w:hAnsi="Times New Roman"/>
+          <w:i/>
+          <w:sz w:val="24"/>
+        </w:rPr>
+        <w:t>trans</w:t>
+      </w:r>
+      <w:r>
+        <w:rPr>
+          <w:rFonts w:ascii="Times New Roman" w:hAnsi="Times New Roman"/>
+          <w:sz w:val="24"/>
+        </w:rPr>
+        <w:t xml:space="preserve"> structures (τ ≈ ±180°) each occupy distinct, non-overlapping regions of the τ–φ plane, such that the negative population-level correlation is a geometric consequence of the discrete classification rather than evidence for dynamic coupling between the two bonds in individual structures. Nevertheless, the relative positioning of τ and φ within each class may influence effective conjugation length. Twisted chromophores reside in more eccentric barrels with narrower minor axes. These observations are consistent with a model in which extended conjugation is associated with an asymmetric barrel that provides less symmetric constraint on torsional freedom, potentially allowing greater non-planar distortion and increased non-radiative decay. </w:t>
+      </w:r>
+      <w:r>
+        <w:rPr>
+          <w:rFonts w:ascii="Times New Roman" w:hAnsi="Times New Roman"/>
+          <w:i/>
+          <w:sz w:val="24"/>
+        </w:rPr>
+        <w:t>Trans</w:t>
+      </w:r>
+      <w:r>
+        <w:rPr>
+          <w:rFonts w:ascii="Times New Roman" w:hAnsi="Times New Roman"/>
+          <w:sz w:val="24"/>
+        </w:rPr>
+        <w:t xml:space="preserve">-configured chromophores had higher eccentricity than </w:t>
+      </w:r>
+      <w:r>
+        <w:rPr>
+          <w:rFonts w:ascii="Times New Roman" w:hAnsi="Times New Roman"/>
+          <w:i/>
+          <w:sz w:val="24"/>
+        </w:rPr>
+        <w:t>cis</w:t>
+      </w:r>
+      <w:r>
+        <w:rPr>
+          <w:rFonts w:ascii="Times New Roman" w:hAnsi="Times New Roman"/>
+          <w:sz w:val="24"/>
+        </w:rPr>
+        <w:t xml:space="preserve"> (0.44 vs 0.40, p &lt; 0.001), lower circularity (0.918 vs 0.923, p = 0.019), and narrower minor axes (29.2 vs 29.6 Å, p = 0.003; Figure S2). The full dihedral analysis is shown in Figure S7.</w:t>
       </w:r>
     </w:p>
     <w:p>
@@ -2107,7 +2392,37 @@
           <w:rFonts w:ascii="Times New Roman" w:hAnsi="Times New Roman"/>
           <w:sz w:val="20"/>
         </w:rPr>
-        <w:t>S2. Barrel geometry by chromophore configuration (cis, trans, and twisted).</w:t>
+        <w:t>S2. Barrel geometry by chromophore configuration (</w:t>
+      </w:r>
+      <w:r>
+        <w:rPr>
+          <w:rFonts w:ascii="Times New Roman" w:hAnsi="Times New Roman"/>
+          <w:i/>
+          <w:sz w:val="20"/>
+        </w:rPr>
+        <w:t>cis</w:t>
+      </w:r>
+      <w:r>
+        <w:rPr>
+          <w:rFonts w:ascii="Times New Roman" w:hAnsi="Times New Roman"/>
+          <w:sz w:val="20"/>
+        </w:rPr>
+        <w:t xml:space="preserve">, </w:t>
+      </w:r>
+      <w:r>
+        <w:rPr>
+          <w:rFonts w:ascii="Times New Roman" w:hAnsi="Times New Roman"/>
+          <w:i/>
+          <w:sz w:val="20"/>
+        </w:rPr>
+        <w:t>trans</w:t>
+      </w:r>
+      <w:r>
+        <w:rPr>
+          <w:rFonts w:ascii="Times New Roman" w:hAnsi="Times New Roman"/>
+          <w:sz w:val="20"/>
+        </w:rPr>
+        <w:t>, and twisted).</w:t>
       </w:r>
     </w:p>
     <w:p/>

</xml_diff>

<commit_message>
Call out Figures 1, 2 (all panels) and S1 in the main text (Reviewer 2)
The submitted version embedded Figures 1 and 2 without citing them in the body.
Add panel-level call-outs: Figure 1A-D (minor axis, eccentricity, circularity,
major axis) in the emission-geometry results, Figure 2A-C (QY, emission, by color
class) in the B-factor results, and Figure S1 (color-class bar charts) in the
emission section. SI-figure renumbering into citation order will follow once the
figure set is finalized.

Co-Authored-By: Claude Opus 4.8 <noreply@anthropic.com>
</commit_message>
<xml_diff>
--- a/GFP_JCIM_Manuscript.docx
+++ b/GFP_JCIM_Manuscript.docx
@@ -740,7 +740,7 @@
           <w:rFonts w:ascii="Times New Roman" w:hAnsi="Times New Roman"/>
           <w:sz w:val="24"/>
         </w:rPr>
-        <w:t>Barrel geometry varied with emission color class. Eccentricity (Kruskal–Wallis H = 113.2, p = 8.6 × 10⁻²³), minor axis (H = 108.9, p = 7.0 × 10⁻²²), and circularity (H = 103.0, p = 1.2 × 10⁻²⁰) all differed across groups. Red fluorescent proteins had the most elliptical barrels and narrowest minor axes; green had the most circular. Emission wavelength correlated with eccentricity (ρ = +0.320, p = 1.4 × 10⁻¹⁶), minor axis (ρ = –0.329, p = 1.9 × 10⁻¹⁷), and circularity (ρ = –0.258, p = 4.5 × 10⁻¹¹). Emission was weakly correlated with the major axis (ρ = +0.176, p = 8.3 × 10⁻⁶) and uncorrelated with barrel length (ρ = –0.028, p = 0.47). All reported p-values were corrected for multiple testing using the Benjamini–Hochberg procedure (q &lt; 0.05); the key correlations remain significant after correction. These associations also strengthen after collapse to one highest-resolution structure per unique FPbase protein (n = 69 unique proteins): minor axis ρ = –0.54, p = 1.9 × 10⁻⁶; eccentricity ρ = +0.50, p = 1.5 × 10⁻⁵; circularity ρ = –0.47, p = 4.3 × 10⁻⁵ (Table S2), ruling out pseudoreplication of related variants as a driver. The correlations of emission with eccentricity, minor axis, and circularity also survive partial correlation analysis controlling for resolution. The major axis and barrel length are uninformative. These data are consistent with a red-shift associated with narrowing of the barrel in one dimension, rather than a general contraction. In DsRed-type red chromophores, an additional oxidation step extends the π-conjugated system by forming an acylimine group at the peptide bond N-terminal to the chromophore-forming tripeptide.¹⁶ The resulting larger chromophore occupies a different steric volume within the barrel pocket, which may contribute to the observed asymmetric narrowing; however, the causal direction of this relationship cannot be established from static crystal structures alone.</w:t>
+        <w:t>Barrel geometry varied with emission color class (Figure S1). Eccentricity (Kruskal–Wallis H = 113.2, p = 8.6 × 10⁻²³), minor axis (H = 108.9, p = 7.0 × 10⁻²²), and circularity (H = 103.0, p = 1.2 × 10⁻²⁰) all differed across groups. Red fluorescent proteins had the most elliptical barrels and narrowest minor axes; green had the most circular. At the single-structure level (Figure 1), emission wavelength correlated with eccentricity (Figure 1B; ρ = +0.320, p = 1.4 × 10⁻¹⁶), minor axis (Figure 1A; ρ = –0.329, p = 1.9 × 10⁻¹⁷), and circularity (Figure 1C; ρ = –0.258, p = 4.5 × 10⁻¹¹). Emission was weakly correlated with the major axis (Figure 1D; ρ = +0.176, p = 8.3 × 10⁻⁶) and uncorrelated with barrel length (ρ = –0.028, p = 0.47). All reported p-values were corrected for multiple testing using the Benjamini–Hochberg procedure (q &lt; 0.05); the key correlations remain significant after correction. These associations also strengthen after collapse to one highest-resolution structure per unique FPbase protein (n = 69 unique proteins): minor axis ρ = –0.54, p = 1.9 × 10⁻⁶; eccentricity ρ = +0.50, p = 1.5 × 10⁻⁵; circularity ρ = –0.47, p = 4.3 × 10⁻⁵ (Table S2), ruling out pseudoreplication of related variants as a driver. The correlations of emission with eccentricity, minor axis, and circularity also survive partial correlation analysis controlling for resolution. The major axis and barrel length are uninformative. These data are consistent with a red-shift associated with narrowing of the barrel in one dimension, rather than a general contraction. In DsRed-type red chromophores, an additional oxidation step extends the π-conjugated system by forming an acylimine group at the peptide bond N-terminal to the chromophore-forming tripeptide.¹⁶ The resulting larger chromophore occupies a different steric volume within the barrel pocket, which may contribute to the observed asymmetric narrowing; however, the causal direction of this relationship cannot be established from static crystal structures alone.</w:t>
       </w:r>
     </w:p>
     <w:p>
@@ -824,7 +824,7 @@
           <w:rFonts w:ascii="Times New Roman" w:hAnsi="Times New Roman"/>
           <w:sz w:val="24"/>
         </w:rPr>
-        <w:t>The B-factor ratio (chromophore/barrel) was computed for 739 structures in the canonical cohort. The mean ratio was 0.81 ± 0.22; in 86.3% of structures the chromophore was more rigid than the barrel (ratio &lt; 1). The B-factor ratio was a significant predictor of quantum yield at the cohort level (ρ = –0.309, p = 2.7 × 10⁻⁸, n = 310), surviving partial correlation controlling for resolution (partial ρ = –0.282). Collapsed to one entry per protein, it remains a strong and independent QY correlate (ρ = –0.49, n = 123; Table S6), comparable to chromophore ground-state planarity (see Chromophore Dihedral Geometry, below); the two capture distinct structural routes to brightness and are not an artifact of replicate structures. The ratio varied by color class: blue 0.66 ± 0.19, cyan 0.70 ± 0.15, green 0.76 ± 0.17, yellow 0.79 ± 0.16, orange 0.88 ± 0.22, red 1.02 ± 0.24. In red fluorescent proteins, the chromophore is on average no more rigid than the barrel.</w:t>
+        <w:t>The B-factor ratio (chromophore/barrel) was computed for 739 structures in the canonical cohort. The mean ratio was 0.81 ± 0.22; in 86.3% of structures the chromophore was more rigid than the barrel (ratio &lt; 1). The B-factor ratio was a significant predictor of quantum yield at the cohort level (Figure 2A; ρ = –0.309, p = 2.7 × 10⁻⁸, n = 310), surviving partial correlation controlling for resolution (partial ρ = –0.282). Collapsed to one entry per protein, it remains a strong and independent QY correlate (ρ = –0.49, n = 123; Table S6), comparable to chromophore ground-state planarity (see Chromophore Dihedral Geometry, below); the two capture distinct structural routes to brightness and are not an artifact of replicate structures. The ratio varied by color class (Figure 2C): blue 0.66 ± 0.19, cyan 0.70 ± 0.15, green 0.76 ± 0.17, yellow 0.79 ± 0.16, orange 0.88 ± 0.22, red 1.02 ± 0.24. In red fluorescent proteins, the chromophore is on average no more rigid than the barrel.</w:t>
       </w:r>
     </w:p>
     <w:p>
@@ -837,7 +837,7 @@
           <w:rFonts w:ascii="Times New Roman" w:hAnsi="Times New Roman"/>
           <w:sz w:val="24"/>
         </w:rPr>
-        <w:t>The correlation between B-factor ratio and quantum yield is not simply a proxy for emission wavelength. Although emission correlates with the B-factor ratio (ρ = +0.423), the B-factor ratio carries information about quantum yield beyond emission wavelength alone. The physical interpretation is direct: quantum yield depends on the competition between radiative and non-radiative decay. Non-radiative decay requires conformational motion, particularly rotation about the methine bridge. A chromophore that is rigid relative to its barrel has fewer accessible conformational states and therefore fewer decay pathways. This interpretation is consistent with the engineering examples discussed in the Implications section below. The extended conjugation that produces red emission introduces torsional degrees of freedom that the barrel does not fully constrain, explaining the mean B-factor ratio of 1.02 ± 0.24 for red variants compared to 0.70 ± 0.15 for cyan.</w:t>
+        <w:t>The correlation between B-factor ratio and quantum yield is not simply a proxy for emission wavelength. Although emission correlates with the B-factor ratio (Figure 2B; ρ = +0.423), the B-factor ratio carries information about quantum yield beyond emission wavelength alone. The physical interpretation is direct: quantum yield depends on the competition between radiative and non-radiative decay. Non-radiative decay requires conformational motion, particularly rotation about the methine bridge. A chromophore that is rigid relative to its barrel has fewer accessible conformational states and therefore fewer decay pathways. This interpretation is consistent with the engineering examples discussed in the Implications section below. The extended conjugation that produces red emission introduces torsional degrees of freedom that the barrel does not fully constrain, explaining the mean B-factor ratio of 1.02 ± 0.24 for red variants compared to 0.70 ± 0.15 for cyan.</w:t>
       </w:r>
     </w:p>
     <w:p>

</xml_diff>

<commit_message>
Add funding statement (no external funding)
JCIM requires a funding statement even when none applies. Add "Funding. This
research received no external funding." under Author Information.

Co-Authored-By: Claude Opus 4.8 <noreply@anthropic.com>
</commit_message>
<xml_diff>
--- a/GFP_JCIM_Manuscript.docx
+++ b/GFP_JCIM_Manuscript.docx
@@ -1583,6 +1583,30 @@
           <w:i/>
           <w:sz w:val="24"/>
         </w:rPr>
+        <w:t>Funding.</w:t>
+      </w:r>
+    </w:p>
+    <w:p>
+      <w:pPr>
+        <w:spacing w:line="480" w:lineRule="auto"/>
+        <w:ind w:firstLine="720"/>
+      </w:pPr>
+      <w:r>
+        <w:rPr>
+          <w:rFonts w:ascii="Times New Roman" w:hAnsi="Times New Roman"/>
+          <w:sz w:val="24"/>
+        </w:rPr>
+        <w:t>This research received no external funding.</w:t>
+      </w:r>
+    </w:p>
+    <w:p>
+      <w:r>
+        <w:rPr>
+          <w:rFonts w:ascii="Times New Roman" w:hAnsi="Times New Roman"/>
+          <w:b/>
+          <w:i/>
+          <w:sz w:val="24"/>
+        </w:rPr>
         <w:t>Notes.</w:t>
       </w:r>
     </w:p>

</xml_diff>

<commit_message>
Address JCIM editorial-office formatting requirements
Per the follow-up email from the editorial office:
1. Add corresponding-author e-mail (mzim@conncoll.edu) to the manuscript first
   page.
3. Rename "Code and Data Availability" -> "Data and Software Availability" and
   move it into the main text (before References) as the ACS-required section
   (it had ended up in the SI after the split).
5. Supporting Information file: add a title page matching the manuscript (title
   in title case, authors, affiliation with postal code, corresponding e-mail);
   number figures "Figure S1"-"Figure S8"; number pages S1, S2, ...; no line
   numbers. Produced GFP_JCIM_SI.pdf (clean, Word/PDF, not LaTeX).

Verified: (2) every figure (1, 2, S1-S8) and table (S1-S7) is cited in the text;
(4) the reference list (47) matches the 47 references cited, with no orphans.
Regenerated GFP_JCIM_Manuscript_full.pdf for the ChemRxiv / tracked-changes use.

Co-Authored-By: Claude Opus 4.8 <noreply@anthropic.com>
</commit_message>
<xml_diff>
--- a/GFP_JCIM_Manuscript.docx
+++ b/GFP_JCIM_Manuscript.docx
@@ -39,6 +39,18 @@
           <w:sz w:val="22"/>
         </w:rPr>
         <w:t>Chemistry Department, Connecticut College, New London, CT 06320</w:t>
+      </w:r>
+    </w:p>
+    <w:p>
+      <w:pPr>
+        <w:jc w:val="center"/>
+      </w:pPr>
+      <w:r>
+        <w:rPr>
+          <w:rFonts w:ascii="Times New Roman" w:hAnsi="Times New Roman"/>
+          <w:sz w:val="22"/>
+        </w:rPr>
+        <w:t>*Corresponding author. E-mail: mzim@conncoll.edu</w:t>
       </w:r>
     </w:p>
     <w:p/>
@@ -1629,6 +1641,31 @@
         <w:rPr>
           <w:rFonts w:ascii="Times New Roman" w:hAnsi="Times New Roman"/>
           <w:b/>
+          <w:i/>
+          <w:sz w:val="24"/>
+        </w:rPr>
+        <w:t>Data and Software Availability.</w:t>
+      </w:r>
+    </w:p>
+    <w:p>
+      <w:pPr>
+        <w:spacing w:line="480" w:lineRule="auto"/>
+        <w:ind w:firstLine="720"/>
+      </w:pPr>
+      <w:r>
+        <w:rPr>
+          <w:rFonts w:ascii="Times New Roman" w:hAnsi="Times New Roman"/>
+          <w:sz w:val="24"/>
+        </w:rPr>
+        <w:t>All Python scripts used for CIF parsing, PCA-based barrel axis determination, cross-sectional slicing, convex hull analysis, spectral data matching, B-factor extraction, dihedral angle computation, statistical analysis, and figure generation were developed with the assistance of Claude (Anthropic) via Claude Code and are available at https://github.com/LukeBegg1/gfp-barrel-geometry. The complete per-structure dataset (Table S1) is provided as a CSV file in the Supporting Information.</w:t>
+      </w:r>
+    </w:p>
+    <w:p/>
+    <w:p>
+      <w:r>
+        <w:rPr>
+          <w:rFonts w:ascii="Times New Roman" w:hAnsi="Times New Roman"/>
+          <w:b/>
           <w:sz w:val="28"/>
         </w:rPr>
         <w:t>References</w:t>

</xml_diff>